<commit_message>
Update Instructions: add Step 4 on dangling <none> images
Explains that a <none> image appears per update, is harmless and
deletable, and that student files are unaffected — with a staged
Docker Desktop screenshot.

Co-Authored-By: Claude Fable 5 <noreply@anthropic.com>
</commit_message>
<xml_diff>
--- a/cpp/Update Instructions.docx
+++ b/cpp/Update Instructions.docx
@@ -112,7 +112,7 @@
           <wp:inline distB="114300" distT="114300" distL="114300" distR="114300">
             <wp:extent cx="1571625" cy="1200150"/>
             <wp:effectExtent b="0" l="0" r="0" t="0"/>
-            <wp:docPr id="1" name="image1.png"/>
+            <wp:docPr id="2" name="image1.png"/>
             <a:graphic>
               <a:graphicData uri="http://schemas.openxmlformats.org/drawingml/2006/picture">
                 <pic:pic>
@@ -316,6 +316,119 @@
           <w:szCs w:val="24"/>
         </w:rPr>
       </w:pPr>
+      <w:r>
+        <w:rPr>
+          <w:rFonts w:ascii="Times New Roman" w:cs="Times New Roman" w:eastAsia="Times New Roman" w:hAnsi="Times New Roman"/>
+          <w:sz w:val="24"/>
+          <w:szCs w:val="24"/>
+          <w:u w:val="single"/>
+          <w:rtl w:val="0"/>
+        </w:rPr>
+        <w:t xml:space="preserve">Step 4 Delete dangling containers as necessary:</w:t>
+      </w:r>
+      <w:r>
+        <w:rPr>
+          <w:rtl w:val="0"/>
+        </w:rPr>
+      </w:r>
+    </w:p>
+    <w:p>
+      <w:pPr>
+        <w:rPr>
+          <w:rFonts w:ascii="Times New Roman" w:cs="Times New Roman" w:eastAsia="Times New Roman" w:hAnsi="Times New Roman"/>
+          <w:sz w:val="24"/>
+          <w:szCs w:val="24"/>
+        </w:rPr>
+      </w:pPr>
+      <w:r>
+        <w:rPr>
+          <w:rFonts w:ascii="Times New Roman" w:cs="Times New Roman" w:eastAsia="Times New Roman" w:hAnsi="Times New Roman"/>
+          <w:sz w:val="24"/>
+          <w:szCs w:val="24"/>
+          <w:rtl w:val="0"/>
+        </w:rPr>
+        <w:t xml:space="preserve">A &lt;none&gt; image will appear per update. They are harmless and can be deleted.</w:t>
+      </w:r>
+    </w:p>
+    <w:p>
+      <w:pPr>
+        <w:rPr>
+          <w:rFonts w:ascii="Times New Roman" w:cs="Times New Roman" w:eastAsia="Times New Roman" w:hAnsi="Times New Roman"/>
+          <w:sz w:val="24"/>
+          <w:szCs w:val="24"/>
+        </w:rPr>
+      </w:pPr>
+      <w:r>
+        <w:rPr>
+          <w:rFonts w:ascii="Times New Roman" w:cs="Times New Roman" w:eastAsia="Times New Roman" w:hAnsi="Times New Roman"/>
+          <w:sz w:val="24"/>
+          <w:szCs w:val="24"/>
+          <w:rtl w:val="0"/>
+        </w:rPr>
+        <w:t xml:space="preserve">Files and data should not be affected.</w:t>
+      </w:r>
+    </w:p>
+    <w:p>
+      <w:pPr>
+        <w:rPr>
+          <w:rFonts w:ascii="Times New Roman" w:cs="Times New Roman" w:eastAsia="Times New Roman" w:hAnsi="Times New Roman"/>
+          <w:sz w:val="24"/>
+          <w:szCs w:val="24"/>
+        </w:rPr>
+      </w:pPr>
+      <w:r>
+        <w:rPr>
+          <w:rtl w:val="0"/>
+        </w:rPr>
+      </w:r>
+    </w:p>
+    <w:p>
+      <w:pPr>
+        <w:rPr>
+          <w:rFonts w:ascii="Times New Roman" w:cs="Times New Roman" w:eastAsia="Times New Roman" w:hAnsi="Times New Roman"/>
+          <w:sz w:val="24"/>
+          <w:szCs w:val="24"/>
+        </w:rPr>
+      </w:pPr>
+      <w:r>
+        <w:rPr>
+          <w:rFonts w:ascii="Times New Roman" w:cs="Times New Roman" w:eastAsia="Times New Roman" w:hAnsi="Times New Roman"/>
+          <w:sz w:val="24"/>
+          <w:szCs w:val="24"/>
+        </w:rPr>
+        <w:drawing>
+          <wp:inline distB="114300" distT="114300" distL="114300" distR="114300">
+            <wp:extent cx="5943600" cy="2133600"/>
+            <wp:effectExtent b="0" l="0" r="0" t="0"/>
+            <wp:docPr id="1" name="image2.png"/>
+            <a:graphic>
+              <a:graphicData uri="http://schemas.openxmlformats.org/drawingml/2006/picture">
+                <pic:pic>
+                  <pic:nvPicPr>
+                    <pic:cNvPr id="0" name="image2.png"/>
+                    <pic:cNvPicPr preferRelativeResize="0"/>
+                  </pic:nvPicPr>
+                  <pic:blipFill>
+                    <a:blip r:embed="rId8"/>
+                    <a:srcRect b="0" l="0" r="0" t="0"/>
+                    <a:stretch>
+                      <a:fillRect/>
+                    </a:stretch>
+                  </pic:blipFill>
+                  <pic:spPr>
+                    <a:xfrm>
+                      <a:off x="0" y="0"/>
+                      <a:ext cx="5943600" cy="2133600"/>
+                    </a:xfrm>
+                    <a:prstGeom prst="rect"/>
+                    <a:ln/>
+                  </pic:spPr>
+                </pic:pic>
+              </a:graphicData>
+            </a:graphic>
+          </wp:inline>
+        </w:drawing>
+      </w:r>
       <w:r>
         <w:rPr>
           <w:rtl w:val="0"/>

</xml_diff>